<commit_message>
feat(resume): replace web-print output with clean 2-page ATS-optimized PDF and DOCX resume
</commit_message>
<xml_diff>
--- a/public/Rahul_Motvani_Resume.docx
+++ b/public/Rahul_Motvani_Resume.docx
@@ -27,7 +27,7 @@
     </w:p>
     <w:p>
       <w:pPr>
-        <w:spacing w:after="40" w:lineRule="auto"/>
+        <w:spacing w:after="60" w:lineRule="auto"/>
         <w:jc w:val="center"/>
         <w:rPr/>
       </w:pPr>
@@ -50,7 +50,7 @@
     </w:p>
     <w:p>
       <w:pPr>
-        <w:spacing w:after="40" w:lineRule="auto"/>
+        <w:spacing w:after="60" w:lineRule="auto"/>
         <w:jc w:val="center"/>
         <w:rPr/>
       </w:pPr>
@@ -71,7 +71,7 @@
     </w:p>
     <w:p>
       <w:pPr>
-        <w:spacing w:after="40" w:lineRule="auto"/>
+        <w:spacing w:after="60" w:lineRule="auto"/>
         <w:jc w:val="center"/>
         <w:rPr/>
       </w:pPr>
@@ -95,7 +95,7 @@
         <w:pBdr>
           <w:bottom w:color="1f3864" w:space="2" w:sz="8" w:val="single"/>
         </w:pBdr>
-        <w:spacing w:after="80" w:before="240" w:lineRule="auto"/>
+        <w:spacing w:after="60" w:before="40" w:lineRule="auto"/>
         <w:rPr/>
       </w:pPr>
       <w:r>
@@ -117,7 +117,7 @@
     </w:p>
     <w:p>
       <w:pPr>
-        <w:spacing w:after="80" w:lineRule="auto"/>
+        <w:spacing w:after="60" w:lineRule="auto"/>
         <w:jc w:val="both"/>
         <w:rPr>
           <w:sz w:val="20"/>
@@ -144,7 +144,7 @@
         <w:pBdr>
           <w:bottom w:color="1f3864" w:space="2" w:sz="8" w:val="single"/>
         </w:pBdr>
-        <w:spacing w:after="80" w:before="240" w:lineRule="auto"/>
+        <w:spacing w:after="60" w:before="40" w:lineRule="auto"/>
         <w:rPr/>
       </w:pPr>
       <w:r>
@@ -169,7 +169,7 @@
         <w:tabs>
           <w:tab w:val="right" w:leader="none" w:pos="9360"/>
         </w:tabs>
-        <w:spacing w:after="20" w:before="120" w:lineRule="auto"/>
+        <w:spacing w:after="60" w:before="40" w:lineRule="auto"/>
         <w:rPr/>
       </w:pPr>
       <w:r>
@@ -231,8 +231,8 @@
           <w:between w:space="0" w:sz="0" w:val="nil"/>
         </w:pBdr>
         <w:shd w:fill="auto" w:val="clear"/>
-        <w:spacing w:after="60" w:before="0" w:line="240" w:lineRule="auto"/>
-        <w:ind w:left="360" w:right="0" w:hanging="240"/>
+        <w:spacing w:after="60" w:before="40" w:line="240" w:lineRule="auto"/>
+        <w:ind w:left="600" w:right="600" w:hanging="240"/>
         <w:jc w:val="left"/>
         <w:rPr>
           <w:rFonts w:ascii="Calibri" w:cs="Calibri" w:eastAsia="Calibri" w:hAnsi="Calibri"/>
@@ -293,8 +293,8 @@
           <w:between w:space="0" w:sz="0" w:val="nil"/>
         </w:pBdr>
         <w:shd w:fill="auto" w:val="clear"/>
-        <w:spacing w:after="60" w:before="0" w:line="240" w:lineRule="auto"/>
-        <w:ind w:left="360" w:right="0" w:hanging="240"/>
+        <w:spacing w:after="60" w:before="40" w:line="240" w:lineRule="auto"/>
+        <w:ind w:left="600" w:right="600" w:hanging="240"/>
         <w:jc w:val="left"/>
         <w:rPr>
           <w:rFonts w:ascii="Calibri" w:cs="Calibri" w:eastAsia="Calibri" w:hAnsi="Calibri"/>
@@ -355,8 +355,8 @@
           <w:between w:space="0" w:sz="0" w:val="nil"/>
         </w:pBdr>
         <w:shd w:fill="auto" w:val="clear"/>
-        <w:spacing w:after="60" w:before="0" w:line="240" w:lineRule="auto"/>
-        <w:ind w:left="360" w:right="0" w:hanging="240"/>
+        <w:spacing w:after="60" w:before="40" w:line="240" w:lineRule="auto"/>
+        <w:ind w:left="600" w:right="600" w:hanging="240"/>
         <w:jc w:val="left"/>
         <w:rPr>
           <w:rFonts w:ascii="Calibri" w:cs="Calibri" w:eastAsia="Calibri" w:hAnsi="Calibri"/>
@@ -417,8 +417,8 @@
           <w:between w:space="0" w:sz="0" w:val="nil"/>
         </w:pBdr>
         <w:shd w:fill="auto" w:val="clear"/>
-        <w:spacing w:after="60" w:before="0" w:line="240" w:lineRule="auto"/>
-        <w:ind w:left="360" w:right="0" w:hanging="240"/>
+        <w:spacing w:after="60" w:before="40" w:line="240" w:lineRule="auto"/>
+        <w:ind w:left="600" w:right="600" w:hanging="240"/>
         <w:jc w:val="left"/>
         <w:rPr>
           <w:rFonts w:ascii="Calibri" w:cs="Calibri" w:eastAsia="Calibri" w:hAnsi="Calibri"/>
@@ -479,8 +479,8 @@
           <w:between w:space="0" w:sz="0" w:val="nil"/>
         </w:pBdr>
         <w:shd w:fill="auto" w:val="clear"/>
-        <w:spacing w:after="60" w:before="0" w:line="240" w:lineRule="auto"/>
-        <w:ind w:left="360" w:right="0" w:hanging="240"/>
+        <w:spacing w:after="60" w:before="40" w:line="240" w:lineRule="auto"/>
+        <w:ind w:left="600" w:right="600" w:hanging="240"/>
         <w:jc w:val="left"/>
         <w:rPr>
           <w:rFonts w:ascii="Calibri" w:cs="Calibri" w:eastAsia="Calibri" w:hAnsi="Calibri"/>
@@ -541,8 +541,8 @@
           <w:between w:space="0" w:sz="0" w:val="nil"/>
         </w:pBdr>
         <w:shd w:fill="auto" w:val="clear"/>
-        <w:spacing w:after="60" w:before="0" w:line="240" w:lineRule="auto"/>
-        <w:ind w:left="360" w:right="0" w:hanging="240"/>
+        <w:spacing w:after="60" w:before="40" w:line="240" w:lineRule="auto"/>
+        <w:ind w:left="600" w:right="600" w:hanging="240"/>
         <w:jc w:val="left"/>
         <w:rPr/>
       </w:pPr>
@@ -576,7 +576,7 @@
         <w:tabs>
           <w:tab w:val="right" w:leader="none" w:pos="9360"/>
         </w:tabs>
-        <w:spacing w:after="20" w:before="120" w:lineRule="auto"/>
+        <w:spacing w:after="60" w:before="40" w:lineRule="auto"/>
         <w:rPr/>
       </w:pPr>
       <w:r>
@@ -638,8 +638,8 @@
           <w:between w:space="0" w:sz="0" w:val="nil"/>
         </w:pBdr>
         <w:shd w:fill="auto" w:val="clear"/>
-        <w:spacing w:after="60" w:before="0" w:line="240" w:lineRule="auto"/>
-        <w:ind w:left="360" w:right="0" w:hanging="240"/>
+        <w:spacing w:after="60" w:before="40" w:line="240" w:lineRule="auto"/>
+        <w:ind w:left="600" w:right="600" w:hanging="240"/>
         <w:jc w:val="left"/>
         <w:rPr>
           <w:rFonts w:ascii="Calibri" w:cs="Calibri" w:eastAsia="Calibri" w:hAnsi="Calibri"/>
@@ -700,8 +700,8 @@
           <w:between w:space="0" w:sz="0" w:val="nil"/>
         </w:pBdr>
         <w:shd w:fill="auto" w:val="clear"/>
-        <w:spacing w:after="60" w:before="0" w:line="240" w:lineRule="auto"/>
-        <w:ind w:left="360" w:right="0" w:hanging="240"/>
+        <w:spacing w:after="60" w:before="40" w:line="240" w:lineRule="auto"/>
+        <w:ind w:left="600" w:right="600" w:hanging="240"/>
         <w:jc w:val="left"/>
         <w:rPr>
           <w:rFonts w:ascii="Calibri" w:cs="Calibri" w:eastAsia="Calibri" w:hAnsi="Calibri"/>
@@ -762,8 +762,8 @@
           <w:between w:space="0" w:sz="0" w:val="nil"/>
         </w:pBdr>
         <w:shd w:fill="auto" w:val="clear"/>
-        <w:spacing w:after="60" w:before="0" w:line="240" w:lineRule="auto"/>
-        <w:ind w:left="360" w:right="0" w:hanging="240"/>
+        <w:spacing w:after="60" w:before="40" w:line="240" w:lineRule="auto"/>
+        <w:ind w:left="600" w:right="600" w:hanging="240"/>
         <w:jc w:val="left"/>
         <w:rPr>
           <w:rFonts w:ascii="Calibri" w:cs="Calibri" w:eastAsia="Calibri" w:hAnsi="Calibri"/>
@@ -824,8 +824,8 @@
           <w:between w:space="0" w:sz="0" w:val="nil"/>
         </w:pBdr>
         <w:shd w:fill="auto" w:val="clear"/>
-        <w:spacing w:after="60" w:before="0" w:line="240" w:lineRule="auto"/>
-        <w:ind w:left="360" w:right="0" w:hanging="240"/>
+        <w:spacing w:after="60" w:before="40" w:line="240" w:lineRule="auto"/>
+        <w:ind w:left="600" w:right="600" w:hanging="240"/>
         <w:jc w:val="left"/>
         <w:rPr>
           <w:rFonts w:ascii="Calibri" w:cs="Calibri" w:eastAsia="Calibri" w:hAnsi="Calibri"/>
@@ -873,7 +873,7 @@
         <w:tabs>
           <w:tab w:val="right" w:leader="none" w:pos="9360"/>
         </w:tabs>
-        <w:spacing w:after="20" w:before="120" w:lineRule="auto"/>
+        <w:spacing w:after="60" w:before="40" w:lineRule="auto"/>
         <w:rPr/>
       </w:pPr>
       <w:r>
@@ -935,8 +935,8 @@
           <w:between w:space="0" w:sz="0" w:val="nil"/>
         </w:pBdr>
         <w:shd w:fill="auto" w:val="clear"/>
-        <w:spacing w:after="60" w:before="0" w:line="240" w:lineRule="auto"/>
-        <w:ind w:left="360" w:right="0" w:hanging="240"/>
+        <w:spacing w:after="60" w:before="40" w:line="240" w:lineRule="auto"/>
+        <w:ind w:left="600" w:right="600" w:hanging="240"/>
         <w:jc w:val="left"/>
         <w:rPr>
           <w:rFonts w:ascii="Calibri" w:cs="Calibri" w:eastAsia="Calibri" w:hAnsi="Calibri"/>
@@ -997,8 +997,8 @@
           <w:between w:space="0" w:sz="0" w:val="nil"/>
         </w:pBdr>
         <w:shd w:fill="auto" w:val="clear"/>
-        <w:spacing w:after="60" w:before="0" w:line="240" w:lineRule="auto"/>
-        <w:ind w:left="360" w:right="0" w:hanging="240"/>
+        <w:spacing w:after="60" w:before="40" w:line="240" w:lineRule="auto"/>
+        <w:ind w:left="600" w:right="600" w:hanging="240"/>
         <w:jc w:val="left"/>
         <w:rPr>
           <w:rFonts w:ascii="Calibri" w:cs="Calibri" w:eastAsia="Calibri" w:hAnsi="Calibri"/>
@@ -1059,8 +1059,8 @@
           <w:between w:space="0" w:sz="0" w:val="nil"/>
         </w:pBdr>
         <w:shd w:fill="auto" w:val="clear"/>
-        <w:spacing w:after="60" w:before="0" w:line="240" w:lineRule="auto"/>
-        <w:ind w:left="360" w:right="0" w:hanging="240"/>
+        <w:spacing w:after="60" w:before="40" w:line="240" w:lineRule="auto"/>
+        <w:ind w:left="600" w:right="600" w:hanging="240"/>
         <w:jc w:val="left"/>
         <w:rPr>
           <w:rFonts w:ascii="Calibri" w:cs="Calibri" w:eastAsia="Calibri" w:hAnsi="Calibri"/>
@@ -1121,8 +1121,8 @@
           <w:between w:space="0" w:sz="0" w:val="nil"/>
         </w:pBdr>
         <w:shd w:fill="auto" w:val="clear"/>
-        <w:spacing w:after="60" w:before="0" w:line="240" w:lineRule="auto"/>
-        <w:ind w:left="360" w:right="0" w:hanging="240"/>
+        <w:spacing w:after="60" w:before="40" w:line="240" w:lineRule="auto"/>
+        <w:ind w:left="600" w:right="600" w:hanging="240"/>
         <w:jc w:val="left"/>
         <w:rPr>
           <w:rFonts w:ascii="Calibri" w:cs="Calibri" w:eastAsia="Calibri" w:hAnsi="Calibri"/>
@@ -1170,7 +1170,7 @@
         <w:tabs>
           <w:tab w:val="right" w:leader="none" w:pos="9360"/>
         </w:tabs>
-        <w:spacing w:after="20" w:before="120" w:lineRule="auto"/>
+        <w:spacing w:after="60" w:before="40" w:lineRule="auto"/>
         <w:rPr/>
       </w:pPr>
       <w:r>
@@ -1232,8 +1232,8 @@
           <w:between w:space="0" w:sz="0" w:val="nil"/>
         </w:pBdr>
         <w:shd w:fill="auto" w:val="clear"/>
-        <w:spacing w:after="60" w:before="0" w:line="240" w:lineRule="auto"/>
-        <w:ind w:left="360" w:right="0" w:hanging="240"/>
+        <w:spacing w:after="60" w:before="40" w:line="240" w:lineRule="auto"/>
+        <w:ind w:left="600" w:right="600" w:hanging="240"/>
         <w:jc w:val="left"/>
         <w:rPr>
           <w:rFonts w:ascii="Calibri" w:cs="Calibri" w:eastAsia="Calibri" w:hAnsi="Calibri"/>
@@ -1294,8 +1294,8 @@
           <w:between w:space="0" w:sz="0" w:val="nil"/>
         </w:pBdr>
         <w:shd w:fill="auto" w:val="clear"/>
-        <w:spacing w:after="60" w:before="0" w:line="240" w:lineRule="auto"/>
-        <w:ind w:left="360" w:right="0" w:hanging="240"/>
+        <w:spacing w:after="60" w:before="40" w:line="240" w:lineRule="auto"/>
+        <w:ind w:left="600" w:right="600" w:hanging="240"/>
         <w:jc w:val="left"/>
         <w:rPr>
           <w:rFonts w:ascii="Calibri" w:cs="Calibri" w:eastAsia="Calibri" w:hAnsi="Calibri"/>
@@ -1343,7 +1343,7 @@
         <w:pBdr>
           <w:bottom w:color="1f3864" w:space="2" w:sz="8" w:val="single"/>
         </w:pBdr>
-        <w:spacing w:after="80" w:before="240" w:lineRule="auto"/>
+        <w:spacing w:after="60" w:before="40" w:lineRule="auto"/>
         <w:rPr/>
       </w:pPr>
       <w:r>
@@ -1365,7 +1365,7 @@
     </w:p>
     <w:p>
       <w:pPr>
-        <w:spacing w:after="80" w:lineRule="auto"/>
+        <w:spacing w:after="60" w:lineRule="auto"/>
         <w:rPr>
           <w:sz w:val="20"/>
           <w:szCs w:val="20"/>
@@ -1399,7 +1399,7 @@
     </w:p>
     <w:p>
       <w:pPr>
-        <w:spacing w:after="80" w:lineRule="auto"/>
+        <w:spacing w:after="60" w:lineRule="auto"/>
         <w:rPr>
           <w:sz w:val="20"/>
           <w:szCs w:val="20"/>
@@ -1433,7 +1433,7 @@
     </w:p>
     <w:p>
       <w:pPr>
-        <w:spacing w:after="80" w:lineRule="auto"/>
+        <w:spacing w:after="60" w:lineRule="auto"/>
         <w:rPr>
           <w:sz w:val="20"/>
           <w:szCs w:val="20"/>
@@ -1467,7 +1467,7 @@
     </w:p>
     <w:p>
       <w:pPr>
-        <w:spacing w:after="80" w:lineRule="auto"/>
+        <w:spacing w:after="60" w:lineRule="auto"/>
         <w:rPr>
           <w:sz w:val="20"/>
           <w:szCs w:val="20"/>
@@ -1501,7 +1501,7 @@
     </w:p>
     <w:p>
       <w:pPr>
-        <w:spacing w:after="80" w:lineRule="auto"/>
+        <w:spacing w:after="60" w:lineRule="auto"/>
         <w:rPr>
           <w:sz w:val="20"/>
           <w:szCs w:val="20"/>
@@ -1535,7 +1535,7 @@
     </w:p>
     <w:p>
       <w:pPr>
-        <w:spacing w:after="80" w:lineRule="auto"/>
+        <w:spacing w:after="60" w:lineRule="auto"/>
         <w:rPr>
           <w:sz w:val="20"/>
           <w:szCs w:val="20"/>
@@ -1569,7 +1569,7 @@
     </w:p>
     <w:p>
       <w:pPr>
-        <w:spacing w:after="80" w:lineRule="auto"/>
+        <w:spacing w:after="60" w:lineRule="auto"/>
         <w:rPr>
           <w:sz w:val="20"/>
           <w:szCs w:val="20"/>
@@ -1603,7 +1603,7 @@
     </w:p>
     <w:p>
       <w:pPr>
-        <w:spacing w:after="80" w:lineRule="auto"/>
+        <w:spacing w:after="60" w:lineRule="auto"/>
         <w:rPr>
           <w:sz w:val="20"/>
           <w:szCs w:val="20"/>
@@ -1637,7 +1637,7 @@
     </w:p>
     <w:p>
       <w:pPr>
-        <w:spacing w:after="80" w:lineRule="auto"/>
+        <w:spacing w:after="60" w:lineRule="auto"/>
         <w:rPr>
           <w:sz w:val="20"/>
           <w:szCs w:val="20"/>
@@ -1671,7 +1671,7 @@
     </w:p>
     <w:p>
       <w:pPr>
-        <w:spacing w:after="80" w:lineRule="auto"/>
+        <w:spacing w:after="60" w:lineRule="auto"/>
         <w:rPr>
           <w:sz w:val="20"/>
           <w:szCs w:val="20"/>
@@ -1708,7 +1708,7 @@
         <w:pBdr>
           <w:bottom w:color="1f3864" w:space="2" w:sz="8" w:val="single"/>
         </w:pBdr>
-        <w:spacing w:after="80" w:before="240" w:lineRule="auto"/>
+        <w:spacing w:after="60" w:before="40" w:lineRule="auto"/>
         <w:rPr/>
       </w:pPr>
       <w:r>
@@ -1733,7 +1733,7 @@
         <w:tabs>
           <w:tab w:val="right" w:leader="none" w:pos="9360"/>
         </w:tabs>
-        <w:spacing w:after="20" w:before="100" w:lineRule="auto"/>
+        <w:spacing w:after="60" w:before="40" w:lineRule="auto"/>
         <w:rPr/>
       </w:pPr>
       <w:r>
@@ -1777,7 +1777,7 @@
     </w:p>
     <w:p>
       <w:pPr>
-        <w:spacing w:after="40" w:lineRule="auto"/>
+        <w:spacing w:after="60" w:lineRule="auto"/>
         <w:rPr/>
       </w:pPr>
       <w:r>
@@ -1802,7 +1802,7 @@
         <w:tabs>
           <w:tab w:val="right" w:leader="none" w:pos="9360"/>
         </w:tabs>
-        <w:spacing w:after="20" w:before="100" w:lineRule="auto"/>
+        <w:spacing w:after="60" w:before="40" w:lineRule="auto"/>
         <w:rPr/>
       </w:pPr>
       <w:r>
@@ -1846,7 +1846,7 @@
     </w:p>
     <w:p>
       <w:pPr>
-        <w:spacing w:after="40" w:lineRule="auto"/>
+        <w:spacing w:after="60" w:lineRule="auto"/>
         <w:rPr/>
       </w:pPr>
       <w:r>
@@ -1871,7 +1871,7 @@
         <w:tabs>
           <w:tab w:val="right" w:leader="none" w:pos="9360"/>
         </w:tabs>
-        <w:spacing w:after="20" w:before="100" w:lineRule="auto"/>
+        <w:spacing w:after="60" w:before="40" w:lineRule="auto"/>
         <w:rPr/>
       </w:pPr>
       <w:r>
@@ -1915,7 +1915,7 @@
     </w:p>
     <w:p>
       <w:pPr>
-        <w:spacing w:after="40" w:lineRule="auto"/>
+        <w:spacing w:after="60" w:lineRule="auto"/>
         <w:rPr/>
       </w:pPr>
       <w:r>
@@ -1940,7 +1940,7 @@
         <w:pBdr>
           <w:bottom w:color="1f3864" w:space="2" w:sz="8" w:val="single"/>
         </w:pBdr>
-        <w:spacing w:after="80" w:before="240" w:lineRule="auto"/>
+        <w:spacing w:after="60" w:before="40" w:lineRule="auto"/>
         <w:rPr/>
       </w:pPr>
       <w:r>
@@ -1978,8 +1978,8 @@
           <w:between w:space="0" w:sz="0" w:val="nil"/>
         </w:pBdr>
         <w:shd w:fill="auto" w:val="clear"/>
-        <w:spacing w:after="60" w:before="0" w:line="240" w:lineRule="auto"/>
-        <w:ind w:left="360" w:right="0" w:hanging="240"/>
+        <w:spacing w:after="60" w:before="40" w:line="240" w:lineRule="auto"/>
+        <w:ind w:left="600" w:right="600" w:hanging="240"/>
         <w:jc w:val="left"/>
         <w:rPr/>
       </w:pPr>
@@ -2026,8 +2026,8 @@
           <w:between w:space="0" w:sz="0" w:val="nil"/>
         </w:pBdr>
         <w:shd w:fill="auto" w:val="clear"/>
-        <w:spacing w:after="60" w:before="0" w:line="240" w:lineRule="auto"/>
-        <w:ind w:left="360" w:right="0" w:hanging="240"/>
+        <w:spacing w:after="60" w:before="40" w:line="240" w:lineRule="auto"/>
+        <w:ind w:left="600" w:right="600" w:hanging="240"/>
         <w:jc w:val="left"/>
         <w:rPr/>
       </w:pPr>
@@ -2074,8 +2074,8 @@
           <w:between w:space="0" w:sz="0" w:val="nil"/>
         </w:pBdr>
         <w:shd w:fill="auto" w:val="clear"/>
-        <w:spacing w:after="60" w:before="0" w:line="240" w:lineRule="auto"/>
-        <w:ind w:left="360" w:right="0" w:hanging="240"/>
+        <w:spacing w:after="60" w:before="40" w:line="240" w:lineRule="auto"/>
+        <w:ind w:left="600" w:right="600" w:hanging="240"/>
         <w:jc w:val="left"/>
         <w:rPr/>
       </w:pPr>
@@ -2122,8 +2122,8 @@
           <w:between w:space="0" w:sz="0" w:val="nil"/>
         </w:pBdr>
         <w:shd w:fill="auto" w:val="clear"/>
-        <w:spacing w:after="60" w:before="0" w:line="240" w:lineRule="auto"/>
-        <w:ind w:left="360" w:right="0" w:hanging="240"/>
+        <w:spacing w:after="60" w:before="40" w:line="240" w:lineRule="auto"/>
+        <w:ind w:left="600" w:right="600" w:hanging="240"/>
         <w:jc w:val="left"/>
         <w:rPr/>
       </w:pPr>
@@ -2170,8 +2170,8 @@
           <w:between w:space="0" w:sz="0" w:val="nil"/>
         </w:pBdr>
         <w:shd w:fill="auto" w:val="clear"/>
-        <w:spacing w:after="60" w:before="0" w:line="240" w:lineRule="auto"/>
-        <w:ind w:left="360" w:right="0" w:hanging="240"/>
+        <w:spacing w:after="60" w:before="40" w:line="240" w:lineRule="auto"/>
+        <w:ind w:left="600" w:right="600" w:hanging="240"/>
         <w:jc w:val="left"/>
         <w:rPr/>
       </w:pPr>
@@ -2218,8 +2218,8 @@
           <w:between w:space="0" w:sz="0" w:val="nil"/>
         </w:pBdr>
         <w:shd w:fill="auto" w:val="clear"/>
-        <w:spacing w:after="60" w:before="0" w:line="240" w:lineRule="auto"/>
-        <w:ind w:left="360" w:right="0" w:hanging="240"/>
+        <w:spacing w:after="60" w:before="40" w:line="240" w:lineRule="auto"/>
+        <w:ind w:left="600" w:right="600" w:hanging="240"/>
         <w:jc w:val="left"/>
         <w:rPr/>
       </w:pPr>
@@ -2250,7 +2250,7 @@
     </w:p>
     <w:p>
       <w:pPr>
-        <w:spacing w:after="40" w:before="80" w:lineRule="auto"/>
+        <w:spacing w:after="60" w:before="40" w:lineRule="auto"/>
         <w:rPr/>
       </w:pPr>
       <w:r>
@@ -2280,7 +2280,7 @@
         <w:pBdr>
           <w:bottom w:color="1f3864" w:space="2" w:sz="8" w:val="single"/>
         </w:pBdr>
-        <w:spacing w:after="80" w:before="240" w:lineRule="auto"/>
+        <w:spacing w:after="60" w:before="40" w:lineRule="auto"/>
         <w:rPr/>
       </w:pPr>
       <w:r>
@@ -2302,7 +2302,7 @@
     </w:p>
     <w:p>
       <w:pPr>
-        <w:spacing w:after="80" w:lineRule="auto"/>
+        <w:spacing w:after="60" w:lineRule="auto"/>
         <w:jc w:val="both"/>
         <w:rPr/>
       </w:pPr>
@@ -2321,7 +2321,7 @@
     </w:p>
     <w:sectPr>
       <w:pgSz w:h="15840" w:w="12240" w:orient="portrait"/>
-      <w:pgMar w:bottom="1080" w:top="1080" w:left="1440" w:right="1440" w:header="708" w:footer="708"/>
+      <w:pgMar w:bottom="500" w:top="500" w:left="600" w:right="600" w:header="708" w:footer="708"/>
       <w:pgNumType w:start="1"/>
     </w:sectPr>
   </w:body>

</xml_diff>

<commit_message>
fix(resume): update downloadable PDF and DOCX assets from latest Google Doc
</commit_message>
<xml_diff>
--- a/public/Rahul_Motvani_Resume.docx
+++ b/public/Rahul_Motvani_Resume.docx
@@ -27,7 +27,7 @@
     </w:p>
     <w:p>
       <w:pPr>
-        <w:spacing w:after="60" w:lineRule="auto"/>
+        <w:spacing w:after="40" w:lineRule="auto"/>
         <w:jc w:val="center"/>
         <w:rPr/>
       </w:pPr>
@@ -50,7 +50,7 @@
     </w:p>
     <w:p>
       <w:pPr>
-        <w:spacing w:after="60" w:lineRule="auto"/>
+        <w:spacing w:after="40" w:lineRule="auto"/>
         <w:jc w:val="center"/>
         <w:rPr/>
       </w:pPr>
@@ -71,7 +71,7 @@
     </w:p>
     <w:p>
       <w:pPr>
-        <w:spacing w:after="60" w:lineRule="auto"/>
+        <w:spacing w:after="40" w:lineRule="auto"/>
         <w:jc w:val="center"/>
         <w:rPr/>
       </w:pPr>
@@ -82,8 +82,39 @@
           <w:szCs w:val="20"/>
           <w:rtl w:val="0"/>
         </w:rPr>
-        <w:t xml:space="preserve">📞 +91 89807 80003   ✉ rahulmotvani8@gmail.com   🔗 LinkedIn</w:t>
-      </w:r>
+        <w:t xml:space="preserve">📞 +91 89807 80003   ✉ rahulmotvani8@gmail.com   🔗 </w:t>
+      </w:r>
+      <w:hyperlink r:id="rId6">
+        <w:r>
+          <w:rPr>
+            <w:color w:val="555555"/>
+            <w:sz w:val="20"/>
+            <w:szCs w:val="20"/>
+            <w:rtl w:val="0"/>
+          </w:rPr>
+          <w:t xml:space="preserve">LinkedIn</w:t>
+        </w:r>
+      </w:hyperlink>
+      <w:r>
+        <w:rPr>
+          <w:color w:val="555555"/>
+          <w:sz w:val="20"/>
+          <w:szCs w:val="20"/>
+          <w:rtl w:val="0"/>
+        </w:rPr>
+        <w:t xml:space="preserve"> 🔗 </w:t>
+      </w:r>
+      <w:hyperlink r:id="rId7">
+        <w:r>
+          <w:rPr>
+            <w:color w:val="555555"/>
+            <w:sz w:val="20"/>
+            <w:szCs w:val="20"/>
+            <w:rtl w:val="0"/>
+          </w:rPr>
+          <w:t xml:space="preserve">Portfolio</w:t>
+        </w:r>
+      </w:hyperlink>
       <w:r>
         <w:rPr>
           <w:rtl w:val="0"/>
@@ -95,7 +126,7 @@
         <w:pBdr>
           <w:bottom w:color="1f3864" w:space="2" w:sz="8" w:val="single"/>
         </w:pBdr>
-        <w:spacing w:after="60" w:before="40" w:lineRule="auto"/>
+        <w:spacing w:after="80" w:before="240" w:lineRule="auto"/>
         <w:rPr/>
       </w:pPr>
       <w:r>
@@ -117,7 +148,7 @@
     </w:p>
     <w:p>
       <w:pPr>
-        <w:spacing w:after="60" w:lineRule="auto"/>
+        <w:spacing w:after="80" w:lineRule="auto"/>
         <w:jc w:val="both"/>
         <w:rPr>
           <w:sz w:val="20"/>
@@ -144,7 +175,7 @@
         <w:pBdr>
           <w:bottom w:color="1f3864" w:space="2" w:sz="8" w:val="single"/>
         </w:pBdr>
-        <w:spacing w:after="60" w:before="40" w:lineRule="auto"/>
+        <w:spacing w:after="80" w:before="240" w:lineRule="auto"/>
         <w:rPr/>
       </w:pPr>
       <w:r>
@@ -169,7 +200,7 @@
         <w:tabs>
           <w:tab w:val="right" w:leader="none" w:pos="9360"/>
         </w:tabs>
-        <w:spacing w:after="60" w:before="40" w:lineRule="auto"/>
+        <w:spacing w:after="20" w:before="120" w:lineRule="auto"/>
         <w:rPr/>
       </w:pPr>
       <w:r>
@@ -231,8 +262,8 @@
           <w:between w:space="0" w:sz="0" w:val="nil"/>
         </w:pBdr>
         <w:shd w:fill="auto" w:val="clear"/>
-        <w:spacing w:after="60" w:before="40" w:line="240" w:lineRule="auto"/>
-        <w:ind w:left="600" w:right="600" w:hanging="240"/>
+        <w:spacing w:after="60" w:before="0" w:line="240" w:lineRule="auto"/>
+        <w:ind w:left="360" w:right="0" w:hanging="240"/>
         <w:jc w:val="left"/>
         <w:rPr>
           <w:rFonts w:ascii="Calibri" w:cs="Calibri" w:eastAsia="Calibri" w:hAnsi="Calibri"/>
@@ -293,8 +324,8 @@
           <w:between w:space="0" w:sz="0" w:val="nil"/>
         </w:pBdr>
         <w:shd w:fill="auto" w:val="clear"/>
-        <w:spacing w:after="60" w:before="40" w:line="240" w:lineRule="auto"/>
-        <w:ind w:left="600" w:right="600" w:hanging="240"/>
+        <w:spacing w:after="60" w:before="0" w:line="240" w:lineRule="auto"/>
+        <w:ind w:left="360" w:right="0" w:hanging="240"/>
         <w:jc w:val="left"/>
         <w:rPr>
           <w:rFonts w:ascii="Calibri" w:cs="Calibri" w:eastAsia="Calibri" w:hAnsi="Calibri"/>
@@ -355,8 +386,8 @@
           <w:between w:space="0" w:sz="0" w:val="nil"/>
         </w:pBdr>
         <w:shd w:fill="auto" w:val="clear"/>
-        <w:spacing w:after="60" w:before="40" w:line="240" w:lineRule="auto"/>
-        <w:ind w:left="600" w:right="600" w:hanging="240"/>
+        <w:spacing w:after="60" w:before="0" w:line="240" w:lineRule="auto"/>
+        <w:ind w:left="360" w:right="0" w:hanging="240"/>
         <w:jc w:val="left"/>
         <w:rPr>
           <w:rFonts w:ascii="Calibri" w:cs="Calibri" w:eastAsia="Calibri" w:hAnsi="Calibri"/>
@@ -417,8 +448,8 @@
           <w:between w:space="0" w:sz="0" w:val="nil"/>
         </w:pBdr>
         <w:shd w:fill="auto" w:val="clear"/>
-        <w:spacing w:after="60" w:before="40" w:line="240" w:lineRule="auto"/>
-        <w:ind w:left="600" w:right="600" w:hanging="240"/>
+        <w:spacing w:after="60" w:before="0" w:line="240" w:lineRule="auto"/>
+        <w:ind w:left="360" w:right="0" w:hanging="240"/>
         <w:jc w:val="left"/>
         <w:rPr>
           <w:rFonts w:ascii="Calibri" w:cs="Calibri" w:eastAsia="Calibri" w:hAnsi="Calibri"/>
@@ -479,8 +510,8 @@
           <w:between w:space="0" w:sz="0" w:val="nil"/>
         </w:pBdr>
         <w:shd w:fill="auto" w:val="clear"/>
-        <w:spacing w:after="60" w:before="40" w:line="240" w:lineRule="auto"/>
-        <w:ind w:left="600" w:right="600" w:hanging="240"/>
+        <w:spacing w:after="60" w:before="0" w:line="240" w:lineRule="auto"/>
+        <w:ind w:left="360" w:right="0" w:hanging="240"/>
         <w:jc w:val="left"/>
         <w:rPr>
           <w:rFonts w:ascii="Calibri" w:cs="Calibri" w:eastAsia="Calibri" w:hAnsi="Calibri"/>
@@ -541,8 +572,8 @@
           <w:between w:space="0" w:sz="0" w:val="nil"/>
         </w:pBdr>
         <w:shd w:fill="auto" w:val="clear"/>
-        <w:spacing w:after="60" w:before="40" w:line="240" w:lineRule="auto"/>
-        <w:ind w:left="600" w:right="600" w:hanging="240"/>
+        <w:spacing w:after="60" w:before="0" w:line="240" w:lineRule="auto"/>
+        <w:ind w:left="360" w:right="0" w:hanging="240"/>
         <w:jc w:val="left"/>
         <w:rPr/>
       </w:pPr>
@@ -576,7 +607,7 @@
         <w:tabs>
           <w:tab w:val="right" w:leader="none" w:pos="9360"/>
         </w:tabs>
-        <w:spacing w:after="60" w:before="40" w:lineRule="auto"/>
+        <w:spacing w:after="20" w:before="120" w:lineRule="auto"/>
         <w:rPr/>
       </w:pPr>
       <w:r>
@@ -638,8 +669,8 @@
           <w:between w:space="0" w:sz="0" w:val="nil"/>
         </w:pBdr>
         <w:shd w:fill="auto" w:val="clear"/>
-        <w:spacing w:after="60" w:before="40" w:line="240" w:lineRule="auto"/>
-        <w:ind w:left="600" w:right="600" w:hanging="240"/>
+        <w:spacing w:after="60" w:before="0" w:line="240" w:lineRule="auto"/>
+        <w:ind w:left="360" w:right="0" w:hanging="240"/>
         <w:jc w:val="left"/>
         <w:rPr>
           <w:rFonts w:ascii="Calibri" w:cs="Calibri" w:eastAsia="Calibri" w:hAnsi="Calibri"/>
@@ -700,8 +731,8 @@
           <w:between w:space="0" w:sz="0" w:val="nil"/>
         </w:pBdr>
         <w:shd w:fill="auto" w:val="clear"/>
-        <w:spacing w:after="60" w:before="40" w:line="240" w:lineRule="auto"/>
-        <w:ind w:left="600" w:right="600" w:hanging="240"/>
+        <w:spacing w:after="60" w:before="0" w:line="240" w:lineRule="auto"/>
+        <w:ind w:left="360" w:right="0" w:hanging="240"/>
         <w:jc w:val="left"/>
         <w:rPr>
           <w:rFonts w:ascii="Calibri" w:cs="Calibri" w:eastAsia="Calibri" w:hAnsi="Calibri"/>
@@ -762,8 +793,8 @@
           <w:between w:space="0" w:sz="0" w:val="nil"/>
         </w:pBdr>
         <w:shd w:fill="auto" w:val="clear"/>
-        <w:spacing w:after="60" w:before="40" w:line="240" w:lineRule="auto"/>
-        <w:ind w:left="600" w:right="600" w:hanging="240"/>
+        <w:spacing w:after="60" w:before="0" w:line="240" w:lineRule="auto"/>
+        <w:ind w:left="360" w:right="0" w:hanging="240"/>
         <w:jc w:val="left"/>
         <w:rPr>
           <w:rFonts w:ascii="Calibri" w:cs="Calibri" w:eastAsia="Calibri" w:hAnsi="Calibri"/>
@@ -824,8 +855,8 @@
           <w:between w:space="0" w:sz="0" w:val="nil"/>
         </w:pBdr>
         <w:shd w:fill="auto" w:val="clear"/>
-        <w:spacing w:after="60" w:before="40" w:line="240" w:lineRule="auto"/>
-        <w:ind w:left="600" w:right="600" w:hanging="240"/>
+        <w:spacing w:after="60" w:before="0" w:line="240" w:lineRule="auto"/>
+        <w:ind w:left="360" w:right="0" w:hanging="240"/>
         <w:jc w:val="left"/>
         <w:rPr>
           <w:rFonts w:ascii="Calibri" w:cs="Calibri" w:eastAsia="Calibri" w:hAnsi="Calibri"/>
@@ -873,7 +904,7 @@
         <w:tabs>
           <w:tab w:val="right" w:leader="none" w:pos="9360"/>
         </w:tabs>
-        <w:spacing w:after="60" w:before="40" w:lineRule="auto"/>
+        <w:spacing w:after="20" w:before="120" w:lineRule="auto"/>
         <w:rPr/>
       </w:pPr>
       <w:r>
@@ -935,8 +966,8 @@
           <w:between w:space="0" w:sz="0" w:val="nil"/>
         </w:pBdr>
         <w:shd w:fill="auto" w:val="clear"/>
-        <w:spacing w:after="60" w:before="40" w:line="240" w:lineRule="auto"/>
-        <w:ind w:left="600" w:right="600" w:hanging="240"/>
+        <w:spacing w:after="60" w:before="0" w:line="240" w:lineRule="auto"/>
+        <w:ind w:left="360" w:right="0" w:hanging="240"/>
         <w:jc w:val="left"/>
         <w:rPr>
           <w:rFonts w:ascii="Calibri" w:cs="Calibri" w:eastAsia="Calibri" w:hAnsi="Calibri"/>
@@ -997,8 +1028,8 @@
           <w:between w:space="0" w:sz="0" w:val="nil"/>
         </w:pBdr>
         <w:shd w:fill="auto" w:val="clear"/>
-        <w:spacing w:after="60" w:before="40" w:line="240" w:lineRule="auto"/>
-        <w:ind w:left="600" w:right="600" w:hanging="240"/>
+        <w:spacing w:after="60" w:before="0" w:line="240" w:lineRule="auto"/>
+        <w:ind w:left="360" w:right="0" w:hanging="240"/>
         <w:jc w:val="left"/>
         <w:rPr>
           <w:rFonts w:ascii="Calibri" w:cs="Calibri" w:eastAsia="Calibri" w:hAnsi="Calibri"/>
@@ -1059,8 +1090,8 @@
           <w:between w:space="0" w:sz="0" w:val="nil"/>
         </w:pBdr>
         <w:shd w:fill="auto" w:val="clear"/>
-        <w:spacing w:after="60" w:before="40" w:line="240" w:lineRule="auto"/>
-        <w:ind w:left="600" w:right="600" w:hanging="240"/>
+        <w:spacing w:after="60" w:before="0" w:line="240" w:lineRule="auto"/>
+        <w:ind w:left="360" w:right="0" w:hanging="240"/>
         <w:jc w:val="left"/>
         <w:rPr>
           <w:rFonts w:ascii="Calibri" w:cs="Calibri" w:eastAsia="Calibri" w:hAnsi="Calibri"/>
@@ -1121,8 +1152,8 @@
           <w:between w:space="0" w:sz="0" w:val="nil"/>
         </w:pBdr>
         <w:shd w:fill="auto" w:val="clear"/>
-        <w:spacing w:after="60" w:before="40" w:line="240" w:lineRule="auto"/>
-        <w:ind w:left="600" w:right="600" w:hanging="240"/>
+        <w:spacing w:after="60" w:before="0" w:line="240" w:lineRule="auto"/>
+        <w:ind w:left="360" w:right="0" w:hanging="240"/>
         <w:jc w:val="left"/>
         <w:rPr>
           <w:rFonts w:ascii="Calibri" w:cs="Calibri" w:eastAsia="Calibri" w:hAnsi="Calibri"/>
@@ -1170,7 +1201,7 @@
         <w:tabs>
           <w:tab w:val="right" w:leader="none" w:pos="9360"/>
         </w:tabs>
-        <w:spacing w:after="60" w:before="40" w:lineRule="auto"/>
+        <w:spacing w:after="20" w:before="120" w:lineRule="auto"/>
         <w:rPr/>
       </w:pPr>
       <w:r>
@@ -1232,8 +1263,8 @@
           <w:between w:space="0" w:sz="0" w:val="nil"/>
         </w:pBdr>
         <w:shd w:fill="auto" w:val="clear"/>
-        <w:spacing w:after="60" w:before="40" w:line="240" w:lineRule="auto"/>
-        <w:ind w:left="600" w:right="600" w:hanging="240"/>
+        <w:spacing w:after="60" w:before="0" w:line="240" w:lineRule="auto"/>
+        <w:ind w:left="360" w:right="0" w:hanging="240"/>
         <w:jc w:val="left"/>
         <w:rPr>
           <w:rFonts w:ascii="Calibri" w:cs="Calibri" w:eastAsia="Calibri" w:hAnsi="Calibri"/>
@@ -1294,8 +1325,8 @@
           <w:between w:space="0" w:sz="0" w:val="nil"/>
         </w:pBdr>
         <w:shd w:fill="auto" w:val="clear"/>
-        <w:spacing w:after="60" w:before="40" w:line="240" w:lineRule="auto"/>
-        <w:ind w:left="600" w:right="600" w:hanging="240"/>
+        <w:spacing w:after="60" w:before="0" w:line="240" w:lineRule="auto"/>
+        <w:ind w:left="360" w:right="0" w:hanging="240"/>
         <w:jc w:val="left"/>
         <w:rPr>
           <w:rFonts w:ascii="Calibri" w:cs="Calibri" w:eastAsia="Calibri" w:hAnsi="Calibri"/>
@@ -1343,7 +1374,7 @@
         <w:pBdr>
           <w:bottom w:color="1f3864" w:space="2" w:sz="8" w:val="single"/>
         </w:pBdr>
-        <w:spacing w:after="60" w:before="40" w:lineRule="auto"/>
+        <w:spacing w:after="80" w:before="240" w:lineRule="auto"/>
         <w:rPr/>
       </w:pPr>
       <w:r>
@@ -1365,7 +1396,7 @@
     </w:p>
     <w:p>
       <w:pPr>
-        <w:spacing w:after="60" w:lineRule="auto"/>
+        <w:spacing w:after="80" w:lineRule="auto"/>
         <w:rPr>
           <w:sz w:val="20"/>
           <w:szCs w:val="20"/>
@@ -1399,7 +1430,7 @@
     </w:p>
     <w:p>
       <w:pPr>
-        <w:spacing w:after="60" w:lineRule="auto"/>
+        <w:spacing w:after="80" w:lineRule="auto"/>
         <w:rPr>
           <w:sz w:val="20"/>
           <w:szCs w:val="20"/>
@@ -1433,7 +1464,7 @@
     </w:p>
     <w:p>
       <w:pPr>
-        <w:spacing w:after="60" w:lineRule="auto"/>
+        <w:spacing w:after="80" w:lineRule="auto"/>
         <w:rPr>
           <w:sz w:val="20"/>
           <w:szCs w:val="20"/>
@@ -1467,7 +1498,7 @@
     </w:p>
     <w:p>
       <w:pPr>
-        <w:spacing w:after="60" w:lineRule="auto"/>
+        <w:spacing w:after="80" w:lineRule="auto"/>
         <w:rPr>
           <w:sz w:val="20"/>
           <w:szCs w:val="20"/>
@@ -1501,7 +1532,7 @@
     </w:p>
     <w:p>
       <w:pPr>
-        <w:spacing w:after="60" w:lineRule="auto"/>
+        <w:spacing w:after="80" w:lineRule="auto"/>
         <w:rPr>
           <w:sz w:val="20"/>
           <w:szCs w:val="20"/>
@@ -1535,7 +1566,7 @@
     </w:p>
     <w:p>
       <w:pPr>
-        <w:spacing w:after="60" w:lineRule="auto"/>
+        <w:spacing w:after="80" w:lineRule="auto"/>
         <w:rPr>
           <w:sz w:val="20"/>
           <w:szCs w:val="20"/>
@@ -1569,7 +1600,7 @@
     </w:p>
     <w:p>
       <w:pPr>
-        <w:spacing w:after="60" w:lineRule="auto"/>
+        <w:spacing w:after="80" w:lineRule="auto"/>
         <w:rPr>
           <w:sz w:val="20"/>
           <w:szCs w:val="20"/>
@@ -1603,7 +1634,7 @@
     </w:p>
     <w:p>
       <w:pPr>
-        <w:spacing w:after="60" w:lineRule="auto"/>
+        <w:spacing w:after="80" w:lineRule="auto"/>
         <w:rPr>
           <w:sz w:val="20"/>
           <w:szCs w:val="20"/>
@@ -1637,7 +1668,7 @@
     </w:p>
     <w:p>
       <w:pPr>
-        <w:spacing w:after="60" w:lineRule="auto"/>
+        <w:spacing w:after="80" w:lineRule="auto"/>
         <w:rPr>
           <w:sz w:val="20"/>
           <w:szCs w:val="20"/>
@@ -1671,7 +1702,7 @@
     </w:p>
     <w:p>
       <w:pPr>
-        <w:spacing w:after="60" w:lineRule="auto"/>
+        <w:spacing w:after="80" w:lineRule="auto"/>
         <w:rPr>
           <w:sz w:val="20"/>
           <w:szCs w:val="20"/>
@@ -1708,7 +1739,7 @@
         <w:pBdr>
           <w:bottom w:color="1f3864" w:space="2" w:sz="8" w:val="single"/>
         </w:pBdr>
-        <w:spacing w:after="60" w:before="40" w:lineRule="auto"/>
+        <w:spacing w:after="80" w:before="240" w:lineRule="auto"/>
         <w:rPr/>
       </w:pPr>
       <w:r>
@@ -1733,7 +1764,7 @@
         <w:tabs>
           <w:tab w:val="right" w:leader="none" w:pos="9360"/>
         </w:tabs>
-        <w:spacing w:after="60" w:before="40" w:lineRule="auto"/>
+        <w:spacing w:after="20" w:before="100" w:lineRule="auto"/>
         <w:rPr/>
       </w:pPr>
       <w:r>
@@ -1777,7 +1808,7 @@
     </w:p>
     <w:p>
       <w:pPr>
-        <w:spacing w:after="60" w:lineRule="auto"/>
+        <w:spacing w:after="40" w:lineRule="auto"/>
         <w:rPr/>
       </w:pPr>
       <w:r>
@@ -1802,7 +1833,7 @@
         <w:tabs>
           <w:tab w:val="right" w:leader="none" w:pos="9360"/>
         </w:tabs>
-        <w:spacing w:after="60" w:before="40" w:lineRule="auto"/>
+        <w:spacing w:after="20" w:before="100" w:lineRule="auto"/>
         <w:rPr/>
       </w:pPr>
       <w:r>
@@ -1846,7 +1877,7 @@
     </w:p>
     <w:p>
       <w:pPr>
-        <w:spacing w:after="60" w:lineRule="auto"/>
+        <w:spacing w:after="40" w:lineRule="auto"/>
         <w:rPr/>
       </w:pPr>
       <w:r>
@@ -1871,7 +1902,7 @@
         <w:tabs>
           <w:tab w:val="right" w:leader="none" w:pos="9360"/>
         </w:tabs>
-        <w:spacing w:after="60" w:before="40" w:lineRule="auto"/>
+        <w:spacing w:after="20" w:before="100" w:lineRule="auto"/>
         <w:rPr/>
       </w:pPr>
       <w:r>
@@ -1915,7 +1946,7 @@
     </w:p>
     <w:p>
       <w:pPr>
-        <w:spacing w:after="60" w:lineRule="auto"/>
+        <w:spacing w:after="40" w:lineRule="auto"/>
         <w:rPr/>
       </w:pPr>
       <w:r>
@@ -1940,7 +1971,7 @@
         <w:pBdr>
           <w:bottom w:color="1f3864" w:space="2" w:sz="8" w:val="single"/>
         </w:pBdr>
-        <w:spacing w:after="60" w:before="40" w:lineRule="auto"/>
+        <w:spacing w:after="80" w:before="240" w:lineRule="auto"/>
         <w:rPr/>
       </w:pPr>
       <w:r>
@@ -1978,8 +2009,8 @@
           <w:between w:space="0" w:sz="0" w:val="nil"/>
         </w:pBdr>
         <w:shd w:fill="auto" w:val="clear"/>
-        <w:spacing w:after="60" w:before="40" w:line="240" w:lineRule="auto"/>
-        <w:ind w:left="600" w:right="600" w:hanging="240"/>
+        <w:spacing w:after="60" w:before="0" w:line="240" w:lineRule="auto"/>
+        <w:ind w:left="360" w:right="0" w:hanging="240"/>
         <w:jc w:val="left"/>
         <w:rPr/>
       </w:pPr>
@@ -2026,8 +2057,8 @@
           <w:between w:space="0" w:sz="0" w:val="nil"/>
         </w:pBdr>
         <w:shd w:fill="auto" w:val="clear"/>
-        <w:spacing w:after="60" w:before="40" w:line="240" w:lineRule="auto"/>
-        <w:ind w:left="600" w:right="600" w:hanging="240"/>
+        <w:spacing w:after="60" w:before="0" w:line="240" w:lineRule="auto"/>
+        <w:ind w:left="360" w:right="0" w:hanging="240"/>
         <w:jc w:val="left"/>
         <w:rPr/>
       </w:pPr>
@@ -2074,8 +2105,8 @@
           <w:between w:space="0" w:sz="0" w:val="nil"/>
         </w:pBdr>
         <w:shd w:fill="auto" w:val="clear"/>
-        <w:spacing w:after="60" w:before="40" w:line="240" w:lineRule="auto"/>
-        <w:ind w:left="600" w:right="600" w:hanging="240"/>
+        <w:spacing w:after="60" w:before="0" w:line="240" w:lineRule="auto"/>
+        <w:ind w:left="360" w:right="0" w:hanging="240"/>
         <w:jc w:val="left"/>
         <w:rPr/>
       </w:pPr>
@@ -2122,8 +2153,8 @@
           <w:between w:space="0" w:sz="0" w:val="nil"/>
         </w:pBdr>
         <w:shd w:fill="auto" w:val="clear"/>
-        <w:spacing w:after="60" w:before="40" w:line="240" w:lineRule="auto"/>
-        <w:ind w:left="600" w:right="600" w:hanging="240"/>
+        <w:spacing w:after="60" w:before="0" w:line="240" w:lineRule="auto"/>
+        <w:ind w:left="360" w:right="0" w:hanging="240"/>
         <w:jc w:val="left"/>
         <w:rPr/>
       </w:pPr>
@@ -2170,8 +2201,8 @@
           <w:between w:space="0" w:sz="0" w:val="nil"/>
         </w:pBdr>
         <w:shd w:fill="auto" w:val="clear"/>
-        <w:spacing w:after="60" w:before="40" w:line="240" w:lineRule="auto"/>
-        <w:ind w:left="600" w:right="600" w:hanging="240"/>
+        <w:spacing w:after="60" w:before="0" w:line="240" w:lineRule="auto"/>
+        <w:ind w:left="360" w:right="0" w:hanging="240"/>
         <w:jc w:val="left"/>
         <w:rPr/>
       </w:pPr>
@@ -2218,8 +2249,8 @@
           <w:between w:space="0" w:sz="0" w:val="nil"/>
         </w:pBdr>
         <w:shd w:fill="auto" w:val="clear"/>
-        <w:spacing w:after="60" w:before="40" w:line="240" w:lineRule="auto"/>
-        <w:ind w:left="600" w:right="600" w:hanging="240"/>
+        <w:spacing w:after="60" w:before="0" w:line="240" w:lineRule="auto"/>
+        <w:ind w:left="360" w:right="0" w:hanging="240"/>
         <w:jc w:val="left"/>
         <w:rPr/>
       </w:pPr>
@@ -2250,7 +2281,7 @@
     </w:p>
     <w:p>
       <w:pPr>
-        <w:spacing w:after="60" w:before="40" w:lineRule="auto"/>
+        <w:spacing w:after="40" w:before="80" w:lineRule="auto"/>
         <w:rPr/>
       </w:pPr>
       <w:r>
@@ -2280,7 +2311,7 @@
         <w:pBdr>
           <w:bottom w:color="1f3864" w:space="2" w:sz="8" w:val="single"/>
         </w:pBdr>
-        <w:spacing w:after="60" w:before="40" w:lineRule="auto"/>
+        <w:spacing w:after="80" w:before="240" w:lineRule="auto"/>
         <w:rPr/>
       </w:pPr>
       <w:r>
@@ -2302,7 +2333,7 @@
     </w:p>
     <w:p>
       <w:pPr>
-        <w:spacing w:after="60" w:lineRule="auto"/>
+        <w:spacing w:after="80" w:lineRule="auto"/>
         <w:jc w:val="both"/>
         <w:rPr/>
       </w:pPr>
@@ -2321,7 +2352,7 @@
     </w:p>
     <w:sectPr>
       <w:pgSz w:h="15840" w:w="12240" w:orient="portrait"/>
-      <w:pgMar w:bottom="500" w:top="500" w:left="600" w:right="600" w:header="708" w:footer="708"/>
+      <w:pgMar w:bottom="1080" w:top="1080" w:left="1440" w:right="1440" w:header="708" w:footer="708"/>
       <w:pgNumType w:start="1"/>
     </w:sectPr>
   </w:body>

</xml_diff>